<commit_message>
Added memory mapping theory and code example + video example of the compiled code
</commit_message>
<xml_diff>
--- a/hardware/memorie/costuri_memorie.docx
+++ b/hardware/memorie/costuri_memorie.docx
@@ -9,6 +9,34 @@
       </w:pPr>
       <w:r>
         <w:rPr/>
+        <w:t>PERFORMANTA STACK ~ PERFORMANTA DATA SEGMENT &gt; PERFORMANTA HEAP</w:t>
+      </w:r>
+    </w:p>
+    <w:p>
+      <w:pPr>
+        <w:pStyle w:val="Normal"/>
+        <w:rPr>
+          <w:rFonts w:ascii="Aptos Display" w:hAnsi="Aptos Display" w:asciiTheme="majorHAnsi" w:hAnsiTheme="majorHAnsi"/>
+        </w:rPr>
+      </w:pPr>
+      <w:r>
+        <w:rPr>
+          <w:rFonts w:asciiTheme="majorHAnsi" w:hAnsiTheme="majorHAnsi" w:ascii="Aptos Display" w:hAnsi="Aptos Display"/>
+        </w:rPr>
+        <w:t>VARIABILELOR DIN DATA SEGMENT LE ESTE ALOCATA MEMORIE INAINTE SA FIE EXECUTAT MAIN-UL (in memoria virtuala). Acestea sunt incarcate in memoria fizica, de obicei, cand sunt accesate prima data.</w:t>
+      </w:r>
+    </w:p>
+    <w:p>
+      <w:pPr>
+        <w:pStyle w:val="Normal"/>
+        <w:rPr>
+          <w:rFonts w:ascii="Aptos Display" w:hAnsi="Aptos Display" w:asciiTheme="majorHAnsi" w:hAnsiTheme="majorHAnsi"/>
+        </w:rPr>
+      </w:pPr>
+      <w:r>
+        <w:rPr>
+          <w:rFonts w:asciiTheme="majorHAnsi" w:hAnsiTheme="majorHAnsi" w:ascii="Aptos Display" w:hAnsi="Aptos Display"/>
+        </w:rPr>
       </w:r>
     </w:p>
     <w:p>
@@ -117,161 +145,191 @@
         </w:rPr>
       </w:pPr>
       <w:r>
-        <w:rPr/>
-      </w:r>
-    </w:p>
-    <w:p>
-      <w:pPr>
-        <w:pStyle w:val="Normal"/>
-        <w:rPr>
-          <w:rFonts w:ascii="Aptos Display" w:hAnsi="Aptos Display" w:asciiTheme="majorHAnsi" w:hAnsiTheme="majorHAnsi"/>
-        </w:rPr>
-      </w:pPr>
-      <w:r>
-        <w:rPr/>
-      </w:r>
-    </w:p>
-    <w:p>
-      <w:pPr>
-        <w:pStyle w:val="Normal"/>
-        <w:rPr>
-          <w:rFonts w:ascii="Aptos Display" w:hAnsi="Aptos Display" w:asciiTheme="majorHAnsi" w:hAnsiTheme="majorHAnsi"/>
-        </w:rPr>
-      </w:pPr>
-      <w:r>
-        <w:rPr/>
-      </w:r>
-    </w:p>
-    <w:p>
-      <w:pPr>
-        <w:pStyle w:val="Normal"/>
-        <w:rPr>
-          <w:rFonts w:ascii="Aptos Display" w:hAnsi="Aptos Display" w:asciiTheme="majorHAnsi" w:hAnsiTheme="majorHAnsi"/>
-        </w:rPr>
-      </w:pPr>
-      <w:r>
-        <w:rPr/>
-      </w:r>
-    </w:p>
-    <w:p>
-      <w:pPr>
-        <w:pStyle w:val="Normal"/>
-        <w:rPr>
-          <w:rFonts w:ascii="Aptos Display" w:hAnsi="Aptos Display" w:asciiTheme="majorHAnsi" w:hAnsiTheme="majorHAnsi"/>
-        </w:rPr>
-      </w:pPr>
-      <w:r>
-        <w:rPr/>
-      </w:r>
-    </w:p>
-    <w:p>
-      <w:pPr>
-        <w:pStyle w:val="Normal"/>
-        <w:rPr>
-          <w:rFonts w:ascii="Aptos Display" w:hAnsi="Aptos Display" w:asciiTheme="majorHAnsi" w:hAnsiTheme="majorHAnsi"/>
-        </w:rPr>
-      </w:pPr>
-      <w:r>
-        <w:rPr/>
-      </w:r>
-    </w:p>
-    <w:p>
-      <w:pPr>
-        <w:pStyle w:val="Normal"/>
-        <w:rPr>
-          <w:rFonts w:ascii="Aptos Display" w:hAnsi="Aptos Display" w:asciiTheme="majorHAnsi" w:hAnsiTheme="majorHAnsi"/>
-        </w:rPr>
-      </w:pPr>
-      <w:r>
-        <w:rPr/>
-      </w:r>
-    </w:p>
-    <w:p>
-      <w:pPr>
-        <w:pStyle w:val="Normal"/>
-        <w:rPr>
-          <w:rFonts w:ascii="Aptos Display" w:hAnsi="Aptos Display" w:asciiTheme="majorHAnsi" w:hAnsiTheme="majorHAnsi"/>
-        </w:rPr>
-      </w:pPr>
-      <w:r>
-        <w:rPr/>
-      </w:r>
-    </w:p>
-    <w:p>
-      <w:pPr>
-        <w:pStyle w:val="Normal"/>
-        <w:rPr>
-          <w:rFonts w:ascii="Aptos Display" w:hAnsi="Aptos Display" w:asciiTheme="majorHAnsi" w:hAnsiTheme="majorHAnsi"/>
-        </w:rPr>
-      </w:pPr>
-      <w:r>
-        <w:rPr/>
-      </w:r>
-    </w:p>
-    <w:p>
-      <w:pPr>
-        <w:pStyle w:val="Normal"/>
-        <w:rPr>
-          <w:rFonts w:ascii="Aptos Display" w:hAnsi="Aptos Display" w:asciiTheme="majorHAnsi" w:hAnsiTheme="majorHAnsi"/>
-        </w:rPr>
-      </w:pPr>
-      <w:r>
-        <w:rPr/>
-      </w:r>
-    </w:p>
-    <w:p>
-      <w:pPr>
-        <w:pStyle w:val="Normal"/>
-        <w:rPr>
-          <w:rFonts w:ascii="Aptos Display" w:hAnsi="Aptos Display" w:asciiTheme="majorHAnsi" w:hAnsiTheme="majorHAnsi"/>
-        </w:rPr>
-      </w:pPr>
-      <w:r>
-        <w:rPr/>
-      </w:r>
-    </w:p>
-    <w:p>
-      <w:pPr>
-        <w:pStyle w:val="Normal"/>
-        <w:rPr>
-          <w:rFonts w:ascii="Aptos Display" w:hAnsi="Aptos Display" w:asciiTheme="majorHAnsi" w:hAnsiTheme="majorHAnsi"/>
-        </w:rPr>
-      </w:pPr>
-      <w:r>
-        <w:rPr/>
-      </w:r>
-    </w:p>
-    <w:p>
-      <w:pPr>
-        <w:pStyle w:val="Normal"/>
-        <w:rPr>
-          <w:rFonts w:ascii="Aptos Display" w:hAnsi="Aptos Display" w:asciiTheme="majorHAnsi" w:hAnsiTheme="majorHAnsi"/>
-        </w:rPr>
-      </w:pPr>
-      <w:r>
-        <w:rPr/>
-      </w:r>
-    </w:p>
-    <w:p>
-      <w:pPr>
-        <w:pStyle w:val="Normal"/>
-        <w:rPr>
-          <w:rFonts w:ascii="Aptos Display" w:hAnsi="Aptos Display" w:asciiTheme="majorHAnsi" w:hAnsiTheme="majorHAnsi"/>
-        </w:rPr>
-      </w:pPr>
-      <w:r>
-        <w:rPr/>
-      </w:r>
-    </w:p>
-    <w:p>
-      <w:pPr>
-        <w:pStyle w:val="Normal"/>
-        <w:rPr>
-          <w:rFonts w:ascii="Aptos Display" w:hAnsi="Aptos Display" w:asciiTheme="majorHAnsi" w:hAnsiTheme="majorHAnsi"/>
-        </w:rPr>
-      </w:pPr>
-      <w:r>
-        <w:rPr/>
+        <w:rPr>
+          <w:rFonts w:asciiTheme="majorHAnsi" w:hAnsiTheme="majorHAnsi" w:ascii="Aptos Display" w:hAnsi="Aptos Display"/>
+        </w:rPr>
+      </w:r>
+    </w:p>
+    <w:p>
+      <w:pPr>
+        <w:pStyle w:val="Normal"/>
+        <w:rPr>
+          <w:rFonts w:ascii="Aptos Display" w:hAnsi="Aptos Display" w:asciiTheme="majorHAnsi" w:hAnsiTheme="majorHAnsi"/>
+        </w:rPr>
+      </w:pPr>
+      <w:r>
+        <w:rPr>
+          <w:rFonts w:asciiTheme="majorHAnsi" w:hAnsiTheme="majorHAnsi" w:ascii="Aptos Display" w:hAnsi="Aptos Display"/>
+        </w:rPr>
+      </w:r>
+    </w:p>
+    <w:p>
+      <w:pPr>
+        <w:pStyle w:val="Normal"/>
+        <w:rPr>
+          <w:rFonts w:ascii="Aptos Display" w:hAnsi="Aptos Display" w:asciiTheme="majorHAnsi" w:hAnsiTheme="majorHAnsi"/>
+        </w:rPr>
+      </w:pPr>
+      <w:r>
+        <w:rPr>
+          <w:rFonts w:asciiTheme="majorHAnsi" w:hAnsiTheme="majorHAnsi" w:ascii="Aptos Display" w:hAnsi="Aptos Display"/>
+        </w:rPr>
+      </w:r>
+    </w:p>
+    <w:p>
+      <w:pPr>
+        <w:pStyle w:val="Normal"/>
+        <w:rPr>
+          <w:rFonts w:ascii="Aptos Display" w:hAnsi="Aptos Display" w:asciiTheme="majorHAnsi" w:hAnsiTheme="majorHAnsi"/>
+        </w:rPr>
+      </w:pPr>
+      <w:r>
+        <w:rPr>
+          <w:rFonts w:asciiTheme="majorHAnsi" w:hAnsiTheme="majorHAnsi" w:ascii="Aptos Display" w:hAnsi="Aptos Display"/>
+        </w:rPr>
+      </w:r>
+    </w:p>
+    <w:p>
+      <w:pPr>
+        <w:pStyle w:val="Normal"/>
+        <w:rPr>
+          <w:rFonts w:ascii="Aptos Display" w:hAnsi="Aptos Display" w:asciiTheme="majorHAnsi" w:hAnsiTheme="majorHAnsi"/>
+        </w:rPr>
+      </w:pPr>
+      <w:r>
+        <w:rPr>
+          <w:rFonts w:asciiTheme="majorHAnsi" w:hAnsiTheme="majorHAnsi" w:ascii="Aptos Display" w:hAnsi="Aptos Display"/>
+        </w:rPr>
+      </w:r>
+    </w:p>
+    <w:p>
+      <w:pPr>
+        <w:pStyle w:val="Normal"/>
+        <w:rPr>
+          <w:rFonts w:ascii="Aptos Display" w:hAnsi="Aptos Display" w:asciiTheme="majorHAnsi" w:hAnsiTheme="majorHAnsi"/>
+        </w:rPr>
+      </w:pPr>
+      <w:r>
+        <w:rPr>
+          <w:rFonts w:asciiTheme="majorHAnsi" w:hAnsiTheme="majorHAnsi" w:ascii="Aptos Display" w:hAnsi="Aptos Display"/>
+        </w:rPr>
+      </w:r>
+    </w:p>
+    <w:p>
+      <w:pPr>
+        <w:pStyle w:val="Normal"/>
+        <w:rPr>
+          <w:rFonts w:ascii="Aptos Display" w:hAnsi="Aptos Display" w:asciiTheme="majorHAnsi" w:hAnsiTheme="majorHAnsi"/>
+        </w:rPr>
+      </w:pPr>
+      <w:r>
+        <w:rPr>
+          <w:rFonts w:asciiTheme="majorHAnsi" w:hAnsiTheme="majorHAnsi" w:ascii="Aptos Display" w:hAnsi="Aptos Display"/>
+        </w:rPr>
+      </w:r>
+    </w:p>
+    <w:p>
+      <w:pPr>
+        <w:pStyle w:val="Normal"/>
+        <w:rPr>
+          <w:rFonts w:ascii="Aptos Display" w:hAnsi="Aptos Display" w:asciiTheme="majorHAnsi" w:hAnsiTheme="majorHAnsi"/>
+        </w:rPr>
+      </w:pPr>
+      <w:r>
+        <w:rPr>
+          <w:rFonts w:asciiTheme="majorHAnsi" w:hAnsiTheme="majorHAnsi" w:ascii="Aptos Display" w:hAnsi="Aptos Display"/>
+        </w:rPr>
+      </w:r>
+    </w:p>
+    <w:p>
+      <w:pPr>
+        <w:pStyle w:val="Normal"/>
+        <w:rPr>
+          <w:rFonts w:ascii="Aptos Display" w:hAnsi="Aptos Display" w:asciiTheme="majorHAnsi" w:hAnsiTheme="majorHAnsi"/>
+        </w:rPr>
+      </w:pPr>
+      <w:r>
+        <w:rPr>
+          <w:rFonts w:asciiTheme="majorHAnsi" w:hAnsiTheme="majorHAnsi" w:ascii="Aptos Display" w:hAnsi="Aptos Display"/>
+        </w:rPr>
+      </w:r>
+    </w:p>
+    <w:p>
+      <w:pPr>
+        <w:pStyle w:val="Normal"/>
+        <w:rPr>
+          <w:rFonts w:ascii="Aptos Display" w:hAnsi="Aptos Display" w:asciiTheme="majorHAnsi" w:hAnsiTheme="majorHAnsi"/>
+        </w:rPr>
+      </w:pPr>
+      <w:r>
+        <w:rPr>
+          <w:rFonts w:asciiTheme="majorHAnsi" w:hAnsiTheme="majorHAnsi" w:ascii="Aptos Display" w:hAnsi="Aptos Display"/>
+        </w:rPr>
+      </w:r>
+    </w:p>
+    <w:p>
+      <w:pPr>
+        <w:pStyle w:val="Normal"/>
+        <w:rPr>
+          <w:rFonts w:ascii="Aptos Display" w:hAnsi="Aptos Display" w:asciiTheme="majorHAnsi" w:hAnsiTheme="majorHAnsi"/>
+        </w:rPr>
+      </w:pPr>
+      <w:r>
+        <w:rPr>
+          <w:rFonts w:asciiTheme="majorHAnsi" w:hAnsiTheme="majorHAnsi" w:ascii="Aptos Display" w:hAnsi="Aptos Display"/>
+        </w:rPr>
+      </w:r>
+    </w:p>
+    <w:p>
+      <w:pPr>
+        <w:pStyle w:val="Normal"/>
+        <w:rPr>
+          <w:rFonts w:ascii="Aptos Display" w:hAnsi="Aptos Display" w:asciiTheme="majorHAnsi" w:hAnsiTheme="majorHAnsi"/>
+        </w:rPr>
+      </w:pPr>
+      <w:r>
+        <w:rPr>
+          <w:rFonts w:asciiTheme="majorHAnsi" w:hAnsiTheme="majorHAnsi" w:ascii="Aptos Display" w:hAnsi="Aptos Display"/>
+        </w:rPr>
+      </w:r>
+    </w:p>
+    <w:p>
+      <w:pPr>
+        <w:pStyle w:val="Normal"/>
+        <w:rPr>
+          <w:rFonts w:ascii="Aptos Display" w:hAnsi="Aptos Display" w:asciiTheme="majorHAnsi" w:hAnsiTheme="majorHAnsi"/>
+        </w:rPr>
+      </w:pPr>
+      <w:r>
+        <w:rPr>
+          <w:rFonts w:asciiTheme="majorHAnsi" w:hAnsiTheme="majorHAnsi" w:ascii="Aptos Display" w:hAnsi="Aptos Display"/>
+        </w:rPr>
+      </w:r>
+    </w:p>
+    <w:p>
+      <w:pPr>
+        <w:pStyle w:val="Normal"/>
+        <w:rPr>
+          <w:rFonts w:ascii="Aptos Display" w:hAnsi="Aptos Display" w:asciiTheme="majorHAnsi" w:hAnsiTheme="majorHAnsi"/>
+        </w:rPr>
+      </w:pPr>
+      <w:r>
+        <w:rPr>
+          <w:rFonts w:asciiTheme="majorHAnsi" w:hAnsiTheme="majorHAnsi" w:ascii="Aptos Display" w:hAnsi="Aptos Display"/>
+        </w:rPr>
+      </w:r>
+    </w:p>
+    <w:p>
+      <w:pPr>
+        <w:pStyle w:val="Normal"/>
+        <w:rPr>
+          <w:rFonts w:ascii="Aptos Display" w:hAnsi="Aptos Display" w:asciiTheme="majorHAnsi" w:hAnsiTheme="majorHAnsi"/>
+        </w:rPr>
+      </w:pPr>
+      <w:r>
+        <w:rPr>
+          <w:rFonts w:asciiTheme="majorHAnsi" w:hAnsiTheme="majorHAnsi" w:ascii="Aptos Display" w:hAnsi="Aptos Display"/>
+        </w:rPr>
       </w:r>
     </w:p>
     <w:p>
@@ -356,6 +414,7 @@
         <w:rPr>
           <w:rFonts w:asciiTheme="majorHAnsi" w:hAnsiTheme="majorHAnsi" w:ascii="Aptos Display" w:hAnsi="Aptos Display"/>
         </w:rPr>
+        <w:t>(Page fault-ul se face doar daca stack-ul a crescut intre timp)</w:t>
       </w:r>
     </w:p>
     <w:p>
@@ -587,7 +646,19 @@
         <w:rPr>
           <w:rFonts w:ascii="Aptos Display" w:hAnsi="Aptos Display" w:asciiTheme="majorHAnsi" w:hAnsiTheme="majorHAnsi"/>
         </w:rPr>
-        <w:t>Variabilele “static” nu costa sa fie initializate cu “0”, fiindca sunt puse in pagini deja initializate cu 0. Dar costa sa fie aduse in pagini fizice la runtime (cand sunt cerute cum am zis mai jos). Dar costa doar o data.</w:t>
+        <w:t>Variabilele “static” nu costa</w:t>
+      </w:r>
+      <w:r>
+        <w:rPr>
+          <w:rFonts w:ascii="Aptos Display" w:hAnsi="Aptos Display" w:asciiTheme="majorHAnsi" w:hAnsiTheme="majorHAnsi"/>
+        </w:rPr>
+        <w:t xml:space="preserve"> mult</w:t>
+      </w:r>
+      <w:r>
+        <w:rPr>
+          <w:rFonts w:ascii="Aptos Display" w:hAnsi="Aptos Display" w:asciiTheme="majorHAnsi" w:hAnsiTheme="majorHAnsi"/>
+        </w:rPr>
+        <w:t xml:space="preserve"> sa fie initializate cu “0”, fiindca sunt puse in pagini deja initializate cu 0. Dar costa sa fie aduse in pagini fizice la runtime (cand sunt cerute cum am zis mai jos). Dar costa doar o data.</w:t>
       </w:r>
     </w:p>
     <w:p>
@@ -1360,6 +1431,7 @@
     <w:qFormat/>
     <w:pPr>
       <w:widowControl/>
+      <w:suppressAutoHyphens w:val="true"/>
       <w:bidi w:val="0"/>
       <w:spacing w:lineRule="auto" w:line="276" w:before="0" w:after="160"/>
       <w:jc w:val="left"/>

</xml_diff>